<commit_message>
feat: regenerate handouts with Word/Excel optional exercises and update materials links
</commit_message>
<xml_diff>
--- a/handouts/แบบฝึกปฏิบัติแบบ Self-Guided.docx
+++ b/handouts/แบบฝึกปฏิบัติแบบ Self-Guided.docx
@@ -6887,6 +6887,1062 @@
         <w:t>โดยอ้างอิงจากบันทึกข้อความที่ได้</w:t>
       </w:r>
     </w:p>
+    <w:p>
+      <w:pPr>
+        <w:spacing w:before="200" w:after="200"/>
+      </w:pPr>
+      <w:r>
+        <w:rPr>
+          <w:rFonts w:ascii="Sarabun" w:hAnsi="Sarabun" w:cs="Sarabun" w:eastAsia="Sarabun"/>
+          <w:b w:val="0"/>
+          <w:i w:val="0"/>
+          <w:color w:val="D8DEE7"/>
+          <w:sz w:val="16"/>
+        </w:rPr>
+        <w:t>────────────────────────────────────────────────</w:t>
+      </w:r>
+    </w:p>
+    <w:p>
+      <w:pPr>
+        <w:pStyle w:val="Heading2"/>
+        <w:spacing w:before="240" w:after="120" w:line="276" w:lineRule="auto"/>
+      </w:pPr>
+      <w:r>
+        <w:rPr>
+          <w:rFonts w:ascii="Kanit" w:hAnsi="Kanit" w:cs="Kanit" w:eastAsia="Kanit"/>
+          <w:b/>
+          <w:i w:val="0"/>
+          <w:color w:val="353583"/>
+          <w:sz w:val="36"/>
+        </w:rPr>
+        <w:t>แบบฝึกหัดเพิ่มเติม:</w:t>
+      </w:r>
+      <w:r>
+        <w:rPr>
+          <w:rFonts w:ascii="Kanit" w:hAnsi="Kanit" w:cs="Kanit" w:eastAsia="Kanit"/>
+          <w:b/>
+          <w:i w:val="0"/>
+          <w:color w:val="353583"/>
+          <w:sz w:val="36"/>
+        </w:rPr>
+        <w:t xml:space="preserve"> </w:t>
+      </w:r>
+      <w:r>
+        <w:rPr>
+          <w:rFonts w:ascii="Kanit" w:hAnsi="Kanit" w:cs="Kanit" w:eastAsia="Kanit"/>
+          <w:b/>
+          <w:i w:val="0"/>
+          <w:color w:val="353583"/>
+          <w:sz w:val="36"/>
+        </w:rPr>
+        <w:t>ไฟล์</w:t>
+      </w:r>
+      <w:r>
+        <w:rPr>
+          <w:rFonts w:ascii="Kanit" w:hAnsi="Kanit" w:cs="Kanit" w:eastAsia="Kanit"/>
+          <w:b/>
+          <w:i w:val="0"/>
+          <w:color w:val="353583"/>
+          <w:sz w:val="36"/>
+        </w:rPr>
+        <w:t xml:space="preserve"> </w:t>
+      </w:r>
+      <w:r>
+        <w:rPr>
+          <w:rFonts w:ascii="Kanit" w:hAnsi="Kanit" w:cs="Kanit" w:eastAsia="Kanit"/>
+          <w:b/>
+          <w:i w:val="0"/>
+          <w:color w:val="353583"/>
+          <w:sz w:val="36"/>
+        </w:rPr>
+        <w:t>Word</w:t>
+      </w:r>
+      <w:r>
+        <w:rPr>
+          <w:rFonts w:ascii="Kanit" w:hAnsi="Kanit" w:cs="Kanit" w:eastAsia="Kanit"/>
+          <w:b/>
+          <w:i w:val="0"/>
+          <w:color w:val="353583"/>
+          <w:sz w:val="36"/>
+        </w:rPr>
+        <w:t xml:space="preserve"> </w:t>
+      </w:r>
+      <w:r>
+        <w:rPr>
+          <w:rFonts w:ascii="Kanit" w:hAnsi="Kanit" w:cs="Kanit" w:eastAsia="Kanit"/>
+          <w:b/>
+          <w:i w:val="0"/>
+          <w:color w:val="353583"/>
+          <w:sz w:val="36"/>
+        </w:rPr>
+        <w:t>และ</w:t>
+      </w:r>
+      <w:r>
+        <w:rPr>
+          <w:rFonts w:ascii="Kanit" w:hAnsi="Kanit" w:cs="Kanit" w:eastAsia="Kanit"/>
+          <w:b/>
+          <w:i w:val="0"/>
+          <w:color w:val="353583"/>
+          <w:sz w:val="36"/>
+        </w:rPr>
+        <w:t xml:space="preserve"> </w:t>
+      </w:r>
+      <w:r>
+        <w:rPr>
+          <w:rFonts w:ascii="Kanit" w:hAnsi="Kanit" w:cs="Kanit" w:eastAsia="Kanit"/>
+          <w:b/>
+          <w:i w:val="0"/>
+          <w:color w:val="353583"/>
+          <w:sz w:val="36"/>
+        </w:rPr>
+        <w:t>Excel</w:t>
+      </w:r>
+      <w:r>
+        <w:rPr>
+          <w:rFonts w:ascii="Kanit" w:hAnsi="Kanit" w:cs="Kanit" w:eastAsia="Kanit"/>
+          <w:b/>
+          <w:i w:val="0"/>
+          <w:color w:val="353583"/>
+          <w:sz w:val="36"/>
+        </w:rPr>
+        <w:t xml:space="preserve"> </w:t>
+      </w:r>
+      <w:r>
+        <w:rPr>
+          <w:rFonts w:ascii="Kanit" w:hAnsi="Kanit" w:cs="Kanit" w:eastAsia="Kanit"/>
+          <w:b/>
+          <w:i w:val="0"/>
+          <w:color w:val="353583"/>
+          <w:sz w:val="36"/>
+        </w:rPr>
+        <w:t>(ไม่จำกัดเวลา)</w:t>
+      </w:r>
+    </w:p>
+    <w:p>
+      <w:pPr>
+        <w:spacing w:after="160" w:line="324" w:lineRule="auto"/>
+      </w:pPr>
+      <w:r>
+        <w:rPr>
+          <w:rFonts w:ascii="Sarabun" w:hAnsi="Sarabun" w:cs="Sarabun" w:eastAsia="Sarabun"/>
+          <w:b w:val="0"/>
+          <w:i w:val="0"/>
+          <w:color w:val="0E1726"/>
+          <w:sz w:val="24"/>
+        </w:rPr>
+        <w:t>สำหรับผู้ทำ</w:t>
+      </w:r>
+      <w:r>
+        <w:rPr>
+          <w:rFonts w:ascii="Sarabun" w:hAnsi="Sarabun" w:cs="Sarabun" w:eastAsia="Sarabun"/>
+          <w:b w:val="0"/>
+          <w:i w:val="0"/>
+          <w:color w:val="0E1726"/>
+          <w:sz w:val="24"/>
+        </w:rPr>
+        <w:t xml:space="preserve"> </w:t>
+      </w:r>
+      <w:r>
+        <w:rPr>
+          <w:rFonts w:ascii="Sarabun" w:hAnsi="Sarabun" w:cs="Sarabun" w:eastAsia="Sarabun"/>
+          <w:b w:val="0"/>
+          <w:i w:val="0"/>
+          <w:color w:val="0E1726"/>
+          <w:sz w:val="24"/>
+        </w:rPr>
+        <w:t>3</w:t>
+      </w:r>
+      <w:r>
+        <w:rPr>
+          <w:rFonts w:ascii="Sarabun" w:hAnsi="Sarabun" w:cs="Sarabun" w:eastAsia="Sarabun"/>
+          <w:b w:val="0"/>
+          <w:i w:val="0"/>
+          <w:color w:val="0E1726"/>
+          <w:sz w:val="24"/>
+        </w:rPr>
+        <w:t xml:space="preserve"> </w:t>
+      </w:r>
+      <w:r>
+        <w:rPr>
+          <w:rFonts w:ascii="Sarabun" w:hAnsi="Sarabun" w:cs="Sarabun" w:eastAsia="Sarabun"/>
+          <w:b w:val="0"/>
+          <w:i w:val="0"/>
+          <w:color w:val="0E1726"/>
+          <w:sz w:val="24"/>
+        </w:rPr>
+        <w:t>ข้อหลักเสร็จเร็ว</w:t>
+      </w:r>
+      <w:r>
+        <w:rPr>
+          <w:rFonts w:ascii="Sarabun" w:hAnsi="Sarabun" w:cs="Sarabun" w:eastAsia="Sarabun"/>
+          <w:b w:val="0"/>
+          <w:i w:val="0"/>
+          <w:color w:val="0E1726"/>
+          <w:sz w:val="24"/>
+        </w:rPr>
+        <w:t xml:space="preserve"> </w:t>
+      </w:r>
+      <w:r>
+        <w:rPr>
+          <w:rFonts w:ascii="Sarabun" w:hAnsi="Sarabun" w:cs="Sarabun" w:eastAsia="Sarabun"/>
+          <w:b w:val="0"/>
+          <w:i w:val="0"/>
+          <w:color w:val="0E1726"/>
+          <w:sz w:val="24"/>
+        </w:rPr>
+        <w:t>หรือต้องการฝึกเพิ่ม</w:t>
+      </w:r>
+    </w:p>
+    <w:p>
+      <w:pPr>
+        <w:pStyle w:val="Heading3"/>
+        <w:spacing w:before="240" w:after="120" w:line="276" w:lineRule="auto"/>
+      </w:pPr>
+      <w:r>
+        <w:rPr>
+          <w:rFonts w:ascii="Kanit" w:hAnsi="Kanit" w:cs="Kanit" w:eastAsia="Kanit"/>
+          <w:b/>
+          <w:i w:val="0"/>
+          <w:color w:val="003C71"/>
+          <w:sz w:val="30"/>
+        </w:rPr>
+        <w:t>ข้อ</w:t>
+      </w:r>
+      <w:r>
+        <w:rPr>
+          <w:rFonts w:ascii="Kanit" w:hAnsi="Kanit" w:cs="Kanit" w:eastAsia="Kanit"/>
+          <w:b/>
+          <w:i w:val="0"/>
+          <w:color w:val="003C71"/>
+          <w:sz w:val="30"/>
+        </w:rPr>
+        <w:t xml:space="preserve"> </w:t>
+      </w:r>
+      <w:r>
+        <w:rPr>
+          <w:rFonts w:ascii="Kanit" w:hAnsi="Kanit" w:cs="Kanit" w:eastAsia="Kanit"/>
+          <w:b/>
+          <w:i w:val="0"/>
+          <w:color w:val="003C71"/>
+          <w:sz w:val="30"/>
+        </w:rPr>
+        <w:t>4:</w:t>
+      </w:r>
+      <w:r>
+        <w:rPr>
+          <w:rFonts w:ascii="Kanit" w:hAnsi="Kanit" w:cs="Kanit" w:eastAsia="Kanit"/>
+          <w:b/>
+          <w:i w:val="0"/>
+          <w:color w:val="003C71"/>
+          <w:sz w:val="30"/>
+        </w:rPr>
+        <w:t xml:space="preserve"> </w:t>
+      </w:r>
+      <w:r>
+        <w:rPr>
+          <w:rFonts w:ascii="Kanit" w:hAnsi="Kanit" w:cs="Kanit" w:eastAsia="Kanit"/>
+          <w:b/>
+          <w:i w:val="0"/>
+          <w:color w:val="003C71"/>
+          <w:sz w:val="30"/>
+        </w:rPr>
+        <w:t>จัดระเบียบบันทึกข้อความในไฟล์</w:t>
+      </w:r>
+      <w:r>
+        <w:rPr>
+          <w:rFonts w:ascii="Kanit" w:hAnsi="Kanit" w:cs="Kanit" w:eastAsia="Kanit"/>
+          <w:b/>
+          <w:i w:val="0"/>
+          <w:color w:val="003C71"/>
+          <w:sz w:val="30"/>
+        </w:rPr>
+        <w:t xml:space="preserve"> </w:t>
+      </w:r>
+      <w:r>
+        <w:rPr>
+          <w:rFonts w:ascii="Kanit" w:hAnsi="Kanit" w:cs="Kanit" w:eastAsia="Kanit"/>
+          <w:b/>
+          <w:i w:val="0"/>
+          <w:color w:val="003C71"/>
+          <w:sz w:val="30"/>
+        </w:rPr>
+        <w:t>Word</w:t>
+      </w:r>
+    </w:p>
+    <w:p>
+      <w:pPr>
+        <w:spacing w:after="160" w:line="324" w:lineRule="auto"/>
+      </w:pPr>
+      <w:r>
+        <w:rPr>
+          <w:rFonts w:ascii="Sarabun" w:hAnsi="Sarabun" w:cs="Sarabun" w:eastAsia="Sarabun"/>
+          <w:b/>
+          <w:i w:val="0"/>
+          <w:color w:val="0E1726"/>
+          <w:sz w:val="24"/>
+        </w:rPr>
+        <w:t>ไฟล์</w:t>
+      </w:r>
+      <w:r>
+        <w:rPr>
+          <w:rFonts w:ascii="Sarabun" w:hAnsi="Sarabun" w:cs="Sarabun" w:eastAsia="Sarabun"/>
+          <w:b w:val="0"/>
+          <w:i w:val="0"/>
+          <w:color w:val="0E1726"/>
+          <w:sz w:val="24"/>
+        </w:rPr>
+        <w:t>:</w:t>
+      </w:r>
+      <w:r>
+        <w:rPr>
+          <w:rFonts w:ascii="Sarabun" w:hAnsi="Sarabun" w:cs="Sarabun" w:eastAsia="Sarabun"/>
+          <w:b w:val="0"/>
+          <w:i w:val="0"/>
+          <w:color w:val="0E1726"/>
+          <w:sz w:val="24"/>
+        </w:rPr>
+        <w:t xml:space="preserve"> </w:t>
+      </w:r>
+      <w:r>
+        <w:rPr>
+          <w:rFonts w:ascii="Sarabun" w:hAnsi="Sarabun" w:cs="Sarabun" w:eastAsia="Sarabun"/>
+          <w:b w:val="0"/>
+          <w:i w:val="0"/>
+          <w:color w:val="353583"/>
+          <w:sz w:val="22"/>
+          <w:shd w:fill="EEF2F7"/>
+        </w:rPr>
+        <w:t>data/memo_draft.docx</w:t>
+      </w:r>
+    </w:p>
+    <w:p>
+      <w:pPr>
+        <w:spacing w:after="160" w:line="324" w:lineRule="auto"/>
+      </w:pPr>
+      <w:r>
+        <w:rPr>
+          <w:rFonts w:ascii="Sarabun" w:hAnsi="Sarabun" w:cs="Sarabun" w:eastAsia="Sarabun"/>
+          <w:b/>
+          <w:i w:val="0"/>
+          <w:color w:val="0E1726"/>
+          <w:sz w:val="24"/>
+        </w:rPr>
+        <w:t>ขั้นตอน</w:t>
+      </w:r>
+      <w:r>
+        <w:rPr>
+          <w:rFonts w:ascii="Sarabun" w:hAnsi="Sarabun" w:cs="Sarabun" w:eastAsia="Sarabun"/>
+          <w:b w:val="0"/>
+          <w:i w:val="0"/>
+          <w:color w:val="0E1726"/>
+          <w:sz w:val="24"/>
+        </w:rPr>
+        <w:t>:</w:t>
+      </w:r>
+      <w:r>
+        <w:rPr>
+          <w:rFonts w:ascii="Sarabun" w:hAnsi="Sarabun" w:cs="Sarabun" w:eastAsia="Sarabun"/>
+          <w:b w:val="0"/>
+          <w:i w:val="0"/>
+          <w:color w:val="0E1726"/>
+          <w:sz w:val="24"/>
+        </w:rPr>
+        <w:t xml:space="preserve"> </w:t>
+      </w:r>
+      <w:r>
+        <w:rPr>
+          <w:rFonts w:ascii="Sarabun" w:hAnsi="Sarabun" w:cs="Sarabun" w:eastAsia="Sarabun"/>
+          <w:b w:val="0"/>
+          <w:i w:val="0"/>
+          <w:color w:val="0E1726"/>
+          <w:sz w:val="24"/>
+        </w:rPr>
+        <w:t>1.</w:t>
+      </w:r>
+      <w:r>
+        <w:rPr>
+          <w:rFonts w:ascii="Sarabun" w:hAnsi="Sarabun" w:cs="Sarabun" w:eastAsia="Sarabun"/>
+          <w:b w:val="0"/>
+          <w:i w:val="0"/>
+          <w:color w:val="0E1726"/>
+          <w:sz w:val="24"/>
+        </w:rPr>
+        <w:t xml:space="preserve"> </w:t>
+      </w:r>
+      <w:r>
+        <w:rPr>
+          <w:rFonts w:ascii="Sarabun" w:hAnsi="Sarabun" w:cs="Sarabun" w:eastAsia="Sarabun"/>
+          <w:b w:val="0"/>
+          <w:i w:val="0"/>
+          <w:color w:val="0E1726"/>
+          <w:sz w:val="24"/>
+        </w:rPr>
+        <w:t>ดาวน์โหลดและเปิดไฟล์</w:t>
+      </w:r>
+      <w:r>
+        <w:rPr>
+          <w:rFonts w:ascii="Sarabun" w:hAnsi="Sarabun" w:cs="Sarabun" w:eastAsia="Sarabun"/>
+          <w:b w:val="0"/>
+          <w:i w:val="0"/>
+          <w:color w:val="0E1726"/>
+          <w:sz w:val="24"/>
+        </w:rPr>
+        <w:t xml:space="preserve"> </w:t>
+      </w:r>
+      <w:r>
+        <w:rPr>
+          <w:rFonts w:ascii="Sarabun" w:hAnsi="Sarabun" w:cs="Sarabun" w:eastAsia="Sarabun"/>
+          <w:b w:val="0"/>
+          <w:i w:val="0"/>
+          <w:color w:val="353583"/>
+          <w:sz w:val="22"/>
+          <w:shd w:fill="EEF2F7"/>
+        </w:rPr>
+        <w:t>memo_draft.docx</w:t>
+      </w:r>
+      <w:r>
+        <w:rPr>
+          <w:rFonts w:ascii="Sarabun" w:hAnsi="Sarabun" w:cs="Sarabun" w:eastAsia="Sarabun"/>
+          <w:b w:val="0"/>
+          <w:i w:val="0"/>
+          <w:color w:val="0E1726"/>
+          <w:sz w:val="24"/>
+        </w:rPr>
+        <w:t xml:space="preserve"> </w:t>
+      </w:r>
+      <w:r>
+        <w:rPr>
+          <w:rFonts w:ascii="Sarabun" w:hAnsi="Sarabun" w:cs="Sarabun" w:eastAsia="Sarabun"/>
+          <w:b w:val="0"/>
+          <w:i w:val="0"/>
+          <w:color w:val="0E1726"/>
+          <w:sz w:val="24"/>
+        </w:rPr>
+        <w:t>2.</w:t>
+      </w:r>
+      <w:r>
+        <w:rPr>
+          <w:rFonts w:ascii="Sarabun" w:hAnsi="Sarabun" w:cs="Sarabun" w:eastAsia="Sarabun"/>
+          <w:b w:val="0"/>
+          <w:i w:val="0"/>
+          <w:color w:val="0E1726"/>
+          <w:sz w:val="24"/>
+        </w:rPr>
+        <w:t xml:space="preserve"> </w:t>
+      </w:r>
+      <w:r>
+        <w:rPr>
+          <w:rFonts w:ascii="Sarabun" w:hAnsi="Sarabun" w:cs="Sarabun" w:eastAsia="Sarabun"/>
+          <w:b w:val="0"/>
+          <w:i w:val="0"/>
+          <w:color w:val="0E1726"/>
+          <w:sz w:val="24"/>
+        </w:rPr>
+        <w:t>คัดลอกข้อความทั้งหมด</w:t>
+      </w:r>
+      <w:r>
+        <w:rPr>
+          <w:rFonts w:ascii="Sarabun" w:hAnsi="Sarabun" w:cs="Sarabun" w:eastAsia="Sarabun"/>
+          <w:b w:val="0"/>
+          <w:i w:val="0"/>
+          <w:color w:val="0E1726"/>
+          <w:sz w:val="24"/>
+        </w:rPr>
+        <w:t xml:space="preserve"> </w:t>
+      </w:r>
+      <w:r>
+        <w:rPr>
+          <w:rFonts w:ascii="Sarabun" w:hAnsi="Sarabun" w:cs="Sarabun" w:eastAsia="Sarabun"/>
+          <w:b w:val="0"/>
+          <w:i w:val="0"/>
+          <w:color w:val="0E1726"/>
+          <w:sz w:val="24"/>
+        </w:rPr>
+        <w:t>3.</w:t>
+      </w:r>
+      <w:r>
+        <w:rPr>
+          <w:rFonts w:ascii="Sarabun" w:hAnsi="Sarabun" w:cs="Sarabun" w:eastAsia="Sarabun"/>
+          <w:b w:val="0"/>
+          <w:i w:val="0"/>
+          <w:color w:val="0E1726"/>
+          <w:sz w:val="24"/>
+        </w:rPr>
+        <w:t xml:space="preserve"> </w:t>
+      </w:r>
+      <w:r>
+        <w:rPr>
+          <w:rFonts w:ascii="Sarabun" w:hAnsi="Sarabun" w:cs="Sarabun" w:eastAsia="Sarabun"/>
+          <w:b w:val="0"/>
+          <w:i w:val="0"/>
+          <w:color w:val="0E1726"/>
+          <w:sz w:val="24"/>
+        </w:rPr>
+        <w:t>วางลงในแชท</w:t>
+      </w:r>
+      <w:r>
+        <w:rPr>
+          <w:rFonts w:ascii="Sarabun" w:hAnsi="Sarabun" w:cs="Sarabun" w:eastAsia="Sarabun"/>
+          <w:b w:val="0"/>
+          <w:i w:val="0"/>
+          <w:color w:val="0E1726"/>
+          <w:sz w:val="24"/>
+        </w:rPr>
+        <w:t xml:space="preserve"> </w:t>
+      </w:r>
+      <w:r>
+        <w:rPr>
+          <w:rFonts w:ascii="Sarabun" w:hAnsi="Sarabun" w:cs="Sarabun" w:eastAsia="Sarabun"/>
+          <w:b w:val="0"/>
+          <w:i w:val="0"/>
+          <w:color w:val="0E1726"/>
+          <w:sz w:val="24"/>
+        </w:rPr>
+        <w:t>AI</w:t>
+      </w:r>
+      <w:r>
+        <w:rPr>
+          <w:rFonts w:ascii="Sarabun" w:hAnsi="Sarabun" w:cs="Sarabun" w:eastAsia="Sarabun"/>
+          <w:b w:val="0"/>
+          <w:i w:val="0"/>
+          <w:color w:val="0E1726"/>
+          <w:sz w:val="24"/>
+        </w:rPr>
+        <w:t xml:space="preserve"> </w:t>
+      </w:r>
+      <w:r>
+        <w:rPr>
+          <w:rFonts w:ascii="Sarabun" w:hAnsi="Sarabun" w:cs="Sarabun" w:eastAsia="Sarabun"/>
+          <w:b w:val="0"/>
+          <w:i w:val="0"/>
+          <w:color w:val="0E1726"/>
+          <w:sz w:val="24"/>
+        </w:rPr>
+        <w:t>พร้อม</w:t>
+      </w:r>
+      <w:r>
+        <w:rPr>
+          <w:rFonts w:ascii="Sarabun" w:hAnsi="Sarabun" w:cs="Sarabun" w:eastAsia="Sarabun"/>
+          <w:b w:val="0"/>
+          <w:i w:val="0"/>
+          <w:color w:val="0E1726"/>
+          <w:sz w:val="24"/>
+        </w:rPr>
+        <w:t xml:space="preserve"> </w:t>
+      </w:r>
+      <w:r>
+        <w:rPr>
+          <w:rFonts w:ascii="Sarabun" w:hAnsi="Sarabun" w:cs="Sarabun" w:eastAsia="Sarabun"/>
+          <w:b w:val="0"/>
+          <w:i w:val="0"/>
+          <w:color w:val="0E1726"/>
+          <w:sz w:val="24"/>
+        </w:rPr>
+        <w:t>Prompt:</w:t>
+      </w:r>
+    </w:p>
+    <w:tbl>
+      <w:tblPr>
+        <w:tblW w:type="auto" w:w="0"/>
+        <w:jc w:val="left"/>
+        <w:tblLayout w:type="fixed"/>
+        <w:tblLook w:firstColumn="1" w:firstRow="1" w:lastColumn="0" w:lastRow="0" w:noHBand="0" w:noVBand="1" w:val="04A0"/>
+      </w:tblPr>
+      <w:tblGrid>
+        <w:gridCol w:w="9173"/>
+      </w:tblGrid>
+      <w:tr>
+        <w:tc>
+          <w:tcPr>
+            <w:tcW w:type="dxa" w:w="9173"/>
+            <w:vAlign w:val="top"/>
+            <w:shd w:fill="EEF2F7"/>
+            <w:tcBorders>
+              <w:top w:val="single" w:sz="4" w:color="EEF2F7"/>
+              <w:left w:val="single" w:sz="32" w:color="2C2A6E"/>
+              <w:bottom w:val="single" w:sz="4" w:color="EEF2F7"/>
+              <w:right w:val="single" w:sz="4" w:color="EEF2F7"/>
+            </w:tcBorders>
+            <w:tcMar>
+              <w:top w:w="140" w:type="dxa"/>
+              <w:bottom w:w="140" w:type="dxa"/>
+              <w:left w:w="180" w:type="dxa"/>
+              <w:right w:w="180" w:type="dxa"/>
+            </w:tcMar>
+          </w:tcPr>
+          <w:p>
+            <w:pPr>
+              <w:spacing w:after="0" w:line="300" w:lineRule="auto"/>
+            </w:pPr>
+            <w:r/>
+            <w:r>
+              <w:rPr>
+                <w:rFonts w:ascii="Sarabun" w:hAnsi="Sarabun" w:cs="Sarabun" w:eastAsia="Sarabun"/>
+                <w:b w:val="0"/>
+                <w:i w:val="0"/>
+                <w:color w:val="0E1726"/>
+                <w:sz w:val="22"/>
+              </w:rPr>
+              <w:t>คุณคือเจ้าหน้าที่งานเลขานุการของคณะเทคโนโลยีและสิ่งแวดล้อม มหาวิทยาลัยสงขลานครินทร์ วิทยาเขตภูเก็ต</w:t>
+              <w:br/>
+              <w:t>ฉันมีบันทึกข้อความเขียนไม่เป็นระเบียบ ช่วยจัดให้เป็นบันทึกข้อความทางราชการที่ถูกต้อง ตามโครงสร้างนี้:</w:t>
+              <w:br/>
+              <w:t>- ที่</w:t>
+              <w:br/>
+              <w:t>- วันที่</w:t>
+              <w:br/>
+              <w:t>- เรื่อง</w:t>
+              <w:br/>
+              <w:t>- เรียน</w:t>
+              <w:br/>
+              <w:t>- เนื้อหา</w:t>
+              <w:br/>
+              <w:t>- ขออนุมัติ</w:t>
+              <w:br/>
+              <w:t>- ลงชื่อ พร้อมตำแหน่ง</w:t>
+              <w:br/>
+              <w:br/>
+              <w:t>ข้อกำหนด:</w:t>
+              <w:br/>
+              <w:t>- ใช้ภาษาราชการที่สุภาพและกระชับ</w:t>
+              <w:br/>
+              <w:t>- ไม่ต้องเพิ่มข้อมูลใหม่ นอกจากที่มีในข้อความต้นฉบับ</w:t>
+              <w:br/>
+              <w:t>- ความยาวไม่เกิน 250 คำ</w:t>
+              <w:br/>
+              <w:br/>
+              <w:t>ข้อความต้นฉบับ:</w:t>
+              <w:br/>
+              <w:t>[วางข้อความที่คัดลอกมา]</w:t>
+            </w:r>
+          </w:p>
+        </w:tc>
+      </w:tr>
+    </w:tbl>
+    <w:p/>
+    <w:p>
+      <w:pPr>
+        <w:pStyle w:val="Heading3"/>
+        <w:spacing w:before="240" w:after="120" w:line="276" w:lineRule="auto"/>
+      </w:pPr>
+      <w:r>
+        <w:rPr>
+          <w:rFonts w:ascii="Kanit" w:hAnsi="Kanit" w:cs="Kanit" w:eastAsia="Kanit"/>
+          <w:b/>
+          <w:i w:val="0"/>
+          <w:color w:val="003C71"/>
+          <w:sz w:val="30"/>
+        </w:rPr>
+        <w:t>ข้อ</w:t>
+      </w:r>
+      <w:r>
+        <w:rPr>
+          <w:rFonts w:ascii="Kanit" w:hAnsi="Kanit" w:cs="Kanit" w:eastAsia="Kanit"/>
+          <w:b/>
+          <w:i w:val="0"/>
+          <w:color w:val="003C71"/>
+          <w:sz w:val="30"/>
+        </w:rPr>
+        <w:t xml:space="preserve"> </w:t>
+      </w:r>
+      <w:r>
+        <w:rPr>
+          <w:rFonts w:ascii="Kanit" w:hAnsi="Kanit" w:cs="Kanit" w:eastAsia="Kanit"/>
+          <w:b/>
+          <w:i w:val="0"/>
+          <w:color w:val="003C71"/>
+          <w:sz w:val="30"/>
+        </w:rPr>
+        <w:t>5:</w:t>
+      </w:r>
+      <w:r>
+        <w:rPr>
+          <w:rFonts w:ascii="Kanit" w:hAnsi="Kanit" w:cs="Kanit" w:eastAsia="Kanit"/>
+          <w:b/>
+          <w:i w:val="0"/>
+          <w:color w:val="003C71"/>
+          <w:sz w:val="30"/>
+        </w:rPr>
+        <w:t xml:space="preserve"> </w:t>
+      </w:r>
+      <w:r>
+        <w:rPr>
+          <w:rFonts w:ascii="Kanit" w:hAnsi="Kanit" w:cs="Kanit" w:eastAsia="Kanit"/>
+          <w:b/>
+          <w:i w:val="0"/>
+          <w:color w:val="003C71"/>
+          <w:sz w:val="30"/>
+        </w:rPr>
+        <w:t>จัดระเบียบข้อมูลในไฟล์</w:t>
+      </w:r>
+      <w:r>
+        <w:rPr>
+          <w:rFonts w:ascii="Kanit" w:hAnsi="Kanit" w:cs="Kanit" w:eastAsia="Kanit"/>
+          <w:b/>
+          <w:i w:val="0"/>
+          <w:color w:val="003C71"/>
+          <w:sz w:val="30"/>
+        </w:rPr>
+        <w:t xml:space="preserve"> </w:t>
+      </w:r>
+      <w:r>
+        <w:rPr>
+          <w:rFonts w:ascii="Kanit" w:hAnsi="Kanit" w:cs="Kanit" w:eastAsia="Kanit"/>
+          <w:b/>
+          <w:i w:val="0"/>
+          <w:color w:val="003C71"/>
+          <w:sz w:val="30"/>
+        </w:rPr>
+        <w:t>Excel</w:t>
+      </w:r>
+    </w:p>
+    <w:p>
+      <w:pPr>
+        <w:spacing w:after="160" w:line="324" w:lineRule="auto"/>
+      </w:pPr>
+      <w:r>
+        <w:rPr>
+          <w:rFonts w:ascii="Sarabun" w:hAnsi="Sarabun" w:cs="Sarabun" w:eastAsia="Sarabun"/>
+          <w:b/>
+          <w:i w:val="0"/>
+          <w:color w:val="0E1726"/>
+          <w:sz w:val="24"/>
+        </w:rPr>
+        <w:t>ไฟล์</w:t>
+      </w:r>
+      <w:r>
+        <w:rPr>
+          <w:rFonts w:ascii="Sarabun" w:hAnsi="Sarabun" w:cs="Sarabun" w:eastAsia="Sarabun"/>
+          <w:b w:val="0"/>
+          <w:i w:val="0"/>
+          <w:color w:val="0E1726"/>
+          <w:sz w:val="24"/>
+        </w:rPr>
+        <w:t>:</w:t>
+      </w:r>
+      <w:r>
+        <w:rPr>
+          <w:rFonts w:ascii="Sarabun" w:hAnsi="Sarabun" w:cs="Sarabun" w:eastAsia="Sarabun"/>
+          <w:b w:val="0"/>
+          <w:i w:val="0"/>
+          <w:color w:val="0E1726"/>
+          <w:sz w:val="24"/>
+        </w:rPr>
+        <w:t xml:space="preserve"> </w:t>
+      </w:r>
+      <w:r>
+        <w:rPr>
+          <w:rFonts w:ascii="Sarabun" w:hAnsi="Sarabun" w:cs="Sarabun" w:eastAsia="Sarabun"/>
+          <w:b w:val="0"/>
+          <w:i w:val="0"/>
+          <w:color w:val="353583"/>
+          <w:sz w:val="22"/>
+          <w:shd w:fill="EEF2F7"/>
+        </w:rPr>
+        <w:t>data/staff_events.xlsx</w:t>
+      </w:r>
+    </w:p>
+    <w:p>
+      <w:pPr>
+        <w:spacing w:after="160" w:line="324" w:lineRule="auto"/>
+      </w:pPr>
+      <w:r>
+        <w:rPr>
+          <w:rFonts w:ascii="Sarabun" w:hAnsi="Sarabun" w:cs="Sarabun" w:eastAsia="Sarabun"/>
+          <w:b/>
+          <w:i w:val="0"/>
+          <w:color w:val="0E1726"/>
+          <w:sz w:val="24"/>
+        </w:rPr>
+        <w:t>ขั้นตอน</w:t>
+      </w:r>
+      <w:r>
+        <w:rPr>
+          <w:rFonts w:ascii="Sarabun" w:hAnsi="Sarabun" w:cs="Sarabun" w:eastAsia="Sarabun"/>
+          <w:b w:val="0"/>
+          <w:i w:val="0"/>
+          <w:color w:val="0E1726"/>
+          <w:sz w:val="24"/>
+        </w:rPr>
+        <w:t>:</w:t>
+      </w:r>
+      <w:r>
+        <w:rPr>
+          <w:rFonts w:ascii="Sarabun" w:hAnsi="Sarabun" w:cs="Sarabun" w:eastAsia="Sarabun"/>
+          <w:b w:val="0"/>
+          <w:i w:val="0"/>
+          <w:color w:val="0E1726"/>
+          <w:sz w:val="24"/>
+        </w:rPr>
+        <w:t xml:space="preserve"> </w:t>
+      </w:r>
+      <w:r>
+        <w:rPr>
+          <w:rFonts w:ascii="Sarabun" w:hAnsi="Sarabun" w:cs="Sarabun" w:eastAsia="Sarabun"/>
+          <w:b w:val="0"/>
+          <w:i w:val="0"/>
+          <w:color w:val="0E1726"/>
+          <w:sz w:val="24"/>
+        </w:rPr>
+        <w:t>1.</w:t>
+      </w:r>
+      <w:r>
+        <w:rPr>
+          <w:rFonts w:ascii="Sarabun" w:hAnsi="Sarabun" w:cs="Sarabun" w:eastAsia="Sarabun"/>
+          <w:b w:val="0"/>
+          <w:i w:val="0"/>
+          <w:color w:val="0E1726"/>
+          <w:sz w:val="24"/>
+        </w:rPr>
+        <w:t xml:space="preserve"> </w:t>
+      </w:r>
+      <w:r>
+        <w:rPr>
+          <w:rFonts w:ascii="Sarabun" w:hAnsi="Sarabun" w:cs="Sarabun" w:eastAsia="Sarabun"/>
+          <w:b w:val="0"/>
+          <w:i w:val="0"/>
+          <w:color w:val="0E1726"/>
+          <w:sz w:val="24"/>
+        </w:rPr>
+        <w:t>ดาวน์โหลดและเปิดไฟล์</w:t>
+      </w:r>
+      <w:r>
+        <w:rPr>
+          <w:rFonts w:ascii="Sarabun" w:hAnsi="Sarabun" w:cs="Sarabun" w:eastAsia="Sarabun"/>
+          <w:b w:val="0"/>
+          <w:i w:val="0"/>
+          <w:color w:val="0E1726"/>
+          <w:sz w:val="24"/>
+        </w:rPr>
+        <w:t xml:space="preserve"> </w:t>
+      </w:r>
+      <w:r>
+        <w:rPr>
+          <w:rFonts w:ascii="Sarabun" w:hAnsi="Sarabun" w:cs="Sarabun" w:eastAsia="Sarabun"/>
+          <w:b w:val="0"/>
+          <w:i w:val="0"/>
+          <w:color w:val="353583"/>
+          <w:sz w:val="22"/>
+          <w:shd w:fill="EEF2F7"/>
+        </w:rPr>
+        <w:t>staff_events.xlsx</w:t>
+      </w:r>
+      <w:r>
+        <w:rPr>
+          <w:rFonts w:ascii="Sarabun" w:hAnsi="Sarabun" w:cs="Sarabun" w:eastAsia="Sarabun"/>
+          <w:b w:val="0"/>
+          <w:i w:val="0"/>
+          <w:color w:val="0E1726"/>
+          <w:sz w:val="24"/>
+        </w:rPr>
+        <w:t xml:space="preserve"> </w:t>
+      </w:r>
+      <w:r>
+        <w:rPr>
+          <w:rFonts w:ascii="Sarabun" w:hAnsi="Sarabun" w:cs="Sarabun" w:eastAsia="Sarabun"/>
+          <w:b w:val="0"/>
+          <w:i w:val="0"/>
+          <w:color w:val="0E1726"/>
+          <w:sz w:val="24"/>
+        </w:rPr>
+        <w:t>2.</w:t>
+      </w:r>
+      <w:r>
+        <w:rPr>
+          <w:rFonts w:ascii="Sarabun" w:hAnsi="Sarabun" w:cs="Sarabun" w:eastAsia="Sarabun"/>
+          <w:b w:val="0"/>
+          <w:i w:val="0"/>
+          <w:color w:val="0E1726"/>
+          <w:sz w:val="24"/>
+        </w:rPr>
+        <w:t xml:space="preserve"> </w:t>
+      </w:r>
+      <w:r>
+        <w:rPr>
+          <w:rFonts w:ascii="Sarabun" w:hAnsi="Sarabun" w:cs="Sarabun" w:eastAsia="Sarabun"/>
+          <w:b w:val="0"/>
+          <w:i w:val="0"/>
+          <w:color w:val="0E1726"/>
+          <w:sz w:val="24"/>
+        </w:rPr>
+        <w:t>คัดลอกข้อมูลทั้งหมดในตาราง</w:t>
+      </w:r>
+      <w:r>
+        <w:rPr>
+          <w:rFonts w:ascii="Sarabun" w:hAnsi="Sarabun" w:cs="Sarabun" w:eastAsia="Sarabun"/>
+          <w:b w:val="0"/>
+          <w:i w:val="0"/>
+          <w:color w:val="0E1726"/>
+          <w:sz w:val="24"/>
+        </w:rPr>
+        <w:t xml:space="preserve"> </w:t>
+      </w:r>
+      <w:r>
+        <w:rPr>
+          <w:rFonts w:ascii="Sarabun" w:hAnsi="Sarabun" w:cs="Sarabun" w:eastAsia="Sarabun"/>
+          <w:b w:val="0"/>
+          <w:i w:val="0"/>
+          <w:color w:val="0E1726"/>
+          <w:sz w:val="24"/>
+        </w:rPr>
+        <w:t>3.</w:t>
+      </w:r>
+      <w:r>
+        <w:rPr>
+          <w:rFonts w:ascii="Sarabun" w:hAnsi="Sarabun" w:cs="Sarabun" w:eastAsia="Sarabun"/>
+          <w:b w:val="0"/>
+          <w:i w:val="0"/>
+          <w:color w:val="0E1726"/>
+          <w:sz w:val="24"/>
+        </w:rPr>
+        <w:t xml:space="preserve"> </w:t>
+      </w:r>
+      <w:r>
+        <w:rPr>
+          <w:rFonts w:ascii="Sarabun" w:hAnsi="Sarabun" w:cs="Sarabun" w:eastAsia="Sarabun"/>
+          <w:b w:val="0"/>
+          <w:i w:val="0"/>
+          <w:color w:val="0E1726"/>
+          <w:sz w:val="24"/>
+        </w:rPr>
+        <w:t>วางลงในแชท</w:t>
+      </w:r>
+      <w:r>
+        <w:rPr>
+          <w:rFonts w:ascii="Sarabun" w:hAnsi="Sarabun" w:cs="Sarabun" w:eastAsia="Sarabun"/>
+          <w:b w:val="0"/>
+          <w:i w:val="0"/>
+          <w:color w:val="0E1726"/>
+          <w:sz w:val="24"/>
+        </w:rPr>
+        <w:t xml:space="preserve"> </w:t>
+      </w:r>
+      <w:r>
+        <w:rPr>
+          <w:rFonts w:ascii="Sarabun" w:hAnsi="Sarabun" w:cs="Sarabun" w:eastAsia="Sarabun"/>
+          <w:b w:val="0"/>
+          <w:i w:val="0"/>
+          <w:color w:val="0E1726"/>
+          <w:sz w:val="24"/>
+        </w:rPr>
+        <w:t>AI</w:t>
+      </w:r>
+      <w:r>
+        <w:rPr>
+          <w:rFonts w:ascii="Sarabun" w:hAnsi="Sarabun" w:cs="Sarabun" w:eastAsia="Sarabun"/>
+          <w:b w:val="0"/>
+          <w:i w:val="0"/>
+          <w:color w:val="0E1726"/>
+          <w:sz w:val="24"/>
+        </w:rPr>
+        <w:t xml:space="preserve"> </w:t>
+      </w:r>
+      <w:r>
+        <w:rPr>
+          <w:rFonts w:ascii="Sarabun" w:hAnsi="Sarabun" w:cs="Sarabun" w:eastAsia="Sarabun"/>
+          <w:b w:val="0"/>
+          <w:i w:val="0"/>
+          <w:color w:val="0E1726"/>
+          <w:sz w:val="24"/>
+        </w:rPr>
+        <w:t>พร้อม</w:t>
+      </w:r>
+      <w:r>
+        <w:rPr>
+          <w:rFonts w:ascii="Sarabun" w:hAnsi="Sarabun" w:cs="Sarabun" w:eastAsia="Sarabun"/>
+          <w:b w:val="0"/>
+          <w:i w:val="0"/>
+          <w:color w:val="0E1726"/>
+          <w:sz w:val="24"/>
+        </w:rPr>
+        <w:t xml:space="preserve"> </w:t>
+      </w:r>
+      <w:r>
+        <w:rPr>
+          <w:rFonts w:ascii="Sarabun" w:hAnsi="Sarabun" w:cs="Sarabun" w:eastAsia="Sarabun"/>
+          <w:b w:val="0"/>
+          <w:i w:val="0"/>
+          <w:color w:val="0E1726"/>
+          <w:sz w:val="24"/>
+        </w:rPr>
+        <w:t>Prompt:</w:t>
+      </w:r>
+    </w:p>
+    <w:tbl>
+      <w:tblPr>
+        <w:tblW w:type="auto" w:w="0"/>
+        <w:jc w:val="left"/>
+        <w:tblLayout w:type="fixed"/>
+        <w:tblLook w:firstColumn="1" w:firstRow="1" w:lastColumn="0" w:lastRow="0" w:noHBand="0" w:noVBand="1" w:val="04A0"/>
+      </w:tblPr>
+      <w:tblGrid>
+        <w:gridCol w:w="9173"/>
+      </w:tblGrid>
+      <w:tr>
+        <w:tc>
+          <w:tcPr>
+            <w:tcW w:type="dxa" w:w="9173"/>
+            <w:vAlign w:val="top"/>
+            <w:shd w:fill="EEF2F7"/>
+            <w:tcBorders>
+              <w:top w:val="single" w:sz="4" w:color="EEF2F7"/>
+              <w:left w:val="single" w:sz="32" w:color="2C2A6E"/>
+              <w:bottom w:val="single" w:sz="4" w:color="EEF2F7"/>
+              <w:right w:val="single" w:sz="4" w:color="EEF2F7"/>
+            </w:tcBorders>
+            <w:tcMar>
+              <w:top w:w="140" w:type="dxa"/>
+              <w:bottom w:w="140" w:type="dxa"/>
+              <w:left w:w="180" w:type="dxa"/>
+              <w:right w:w="180" w:type="dxa"/>
+            </w:tcMar>
+          </w:tcPr>
+          <w:p>
+            <w:pPr>
+              <w:spacing w:after="0" w:line="300" w:lineRule="auto"/>
+            </w:pPr>
+            <w:r/>
+            <w:r>
+              <w:rPr>
+                <w:rFonts w:ascii="Sarabun" w:hAnsi="Sarabun" w:cs="Sarabun" w:eastAsia="Sarabun"/>
+                <w:b w:val="0"/>
+                <w:i w:val="0"/>
+                <w:color w:val="0E1726"/>
+                <w:sz w:val="22"/>
+              </w:rPr>
+              <w:t>คุณคือเจ้าหน้าที่ฝ่ายวิเคราะห์ข้อมูลของคณะเทคโนโลยีและสิ่งแวดล้อม</w:t>
+              <w:br/>
+              <w:t>ฉันมีข้อมูลกิจกรรมบุคลากรจากไฟล์ Excel ที่บันทึกไม่เป็นระเบียบ ช่วยจัดให้เป็นตารางอ่านง่าย ตามหลักการ:</w:t>
+              <w:br/>
+              <w:t>- 1 คอลัมน์ = 1 หัวข้อ</w:t>
+              <w:br/>
+              <w:t>- 1 แถว = 1 คน 1 กิจกรรม</w:t>
+              <w:br/>
+              <w:t>- 1 ช่อง = 1 ค่า</w:t>
+              <w:br/>
+              <w:br/>
+              <w:t>ข้อมูลต้นฉบับ:</w:t>
+              <w:br/>
+              <w:t>[วางข้อมูลที่คัดลอกมา]</w:t>
+              <w:br/>
+              <w:br/>
+              <w:t>ข้อกำหนด:</w:t>
+              <w:br/>
+              <w:t>1. แยกคอลัมน์ออกเป็น: ลำดับ, ชื่อ-นามสกุล, แผนก/งาน, ชื่อกิจกรรม, วันที่จัดกิจกรรม, สถานที่, หมายเหตุ</w:t>
+              <w:br/>
+              <w:t>2. หากช่องใดไม่มีข้อมูล ให้เว้นว่างไว้ แต่แยกคอลัมน์ถูกต้อง</w:t>
+              <w:br/>
+              <w:t>3. หากมีชื่อหลายคนอยู่ในช่องเดียวกัน ให้แยกเป็นแถวของแต่ละคน</w:t>
+              <w:br/>
+              <w:t>4. แสดงผลลัพธ์ในรูปแบบตารางที่อ่านง่าย</w:t>
+              <w:br/>
+              <w:t>5. อธิบายสั้นๆ ว่าแก้ไขอะไรบ้าง</w:t>
+            </w:r>
+          </w:p>
+        </w:tc>
+      </w:tr>
+    </w:tbl>
+    <w:p/>
     <w:p>
       <w:pPr>
         <w:spacing w:before="200" w:after="200"/>
@@ -7332,6 +8388,181 @@
       </w:tr>
     </w:tbl>
     <w:p/>
+    <w:p>
+      <w:pPr>
+        <w:spacing w:after="160" w:line="324" w:lineRule="auto"/>
+      </w:pPr>
+      <w:r>
+        <w:rPr>
+          <w:rFonts w:ascii="Sarabun" w:hAnsi="Sarabun" w:cs="Sarabun" w:eastAsia="Sarabun"/>
+          <w:b w:val="0"/>
+          <w:i w:val="0"/>
+          <w:color w:val="0E1726"/>
+          <w:sz w:val="24"/>
+        </w:rPr>
+        <w:t>ข้อ</w:t>
+      </w:r>
+      <w:r>
+        <w:rPr>
+          <w:rFonts w:ascii="Sarabun" w:hAnsi="Sarabun" w:cs="Sarabun" w:eastAsia="Sarabun"/>
+          <w:b w:val="0"/>
+          <w:i w:val="0"/>
+          <w:color w:val="0E1726"/>
+          <w:sz w:val="24"/>
+        </w:rPr>
+        <w:t xml:space="preserve"> </w:t>
+      </w:r>
+      <w:r>
+        <w:rPr>
+          <w:rFonts w:ascii="Sarabun" w:hAnsi="Sarabun" w:cs="Sarabun" w:eastAsia="Sarabun"/>
+          <w:b w:val="0"/>
+          <w:i w:val="0"/>
+          <w:color w:val="0E1726"/>
+          <w:sz w:val="24"/>
+        </w:rPr>
+        <w:t>4</w:t>
+      </w:r>
+      <w:r>
+        <w:rPr>
+          <w:rFonts w:ascii="Sarabun" w:hAnsi="Sarabun" w:cs="Sarabun" w:eastAsia="Sarabun"/>
+          <w:b w:val="0"/>
+          <w:i w:val="0"/>
+          <w:color w:val="0E1726"/>
+          <w:sz w:val="24"/>
+        </w:rPr>
+        <w:t xml:space="preserve"> </w:t>
+      </w:r>
+      <w:r>
+        <w:rPr>
+          <w:rFonts w:ascii="Sarabun" w:hAnsi="Sarabun" w:cs="Sarabun" w:eastAsia="Sarabun"/>
+          <w:b w:val="0"/>
+          <w:i w:val="0"/>
+          <w:color w:val="0E1726"/>
+          <w:sz w:val="24"/>
+        </w:rPr>
+        <w:t>และข้อ</w:t>
+      </w:r>
+      <w:r>
+        <w:rPr>
+          <w:rFonts w:ascii="Sarabun" w:hAnsi="Sarabun" w:cs="Sarabun" w:eastAsia="Sarabun"/>
+          <w:b w:val="0"/>
+          <w:i w:val="0"/>
+          <w:color w:val="0E1726"/>
+          <w:sz w:val="24"/>
+        </w:rPr>
+        <w:t xml:space="preserve"> </w:t>
+      </w:r>
+      <w:r>
+        <w:rPr>
+          <w:rFonts w:ascii="Sarabun" w:hAnsi="Sarabun" w:cs="Sarabun" w:eastAsia="Sarabun"/>
+          <w:b w:val="0"/>
+          <w:i w:val="0"/>
+          <w:color w:val="0E1726"/>
+          <w:sz w:val="24"/>
+        </w:rPr>
+        <w:t>5</w:t>
+      </w:r>
+      <w:r>
+        <w:rPr>
+          <w:rFonts w:ascii="Sarabun" w:hAnsi="Sarabun" w:cs="Sarabun" w:eastAsia="Sarabun"/>
+          <w:b w:val="0"/>
+          <w:i w:val="0"/>
+          <w:color w:val="0E1726"/>
+          <w:sz w:val="24"/>
+        </w:rPr>
+        <w:t xml:space="preserve"> </w:t>
+      </w:r>
+      <w:r>
+        <w:rPr>
+          <w:rFonts w:ascii="Sarabun" w:hAnsi="Sarabun" w:cs="Sarabun" w:eastAsia="Sarabun"/>
+          <w:b w:val="0"/>
+          <w:i w:val="0"/>
+          <w:color w:val="0E1726"/>
+          <w:sz w:val="24"/>
+        </w:rPr>
+        <w:t>เป็นแบบฝึกหัดเสริม</w:t>
+      </w:r>
+      <w:r>
+        <w:rPr>
+          <w:rFonts w:ascii="Sarabun" w:hAnsi="Sarabun" w:cs="Sarabun" w:eastAsia="Sarabun"/>
+          <w:b w:val="0"/>
+          <w:i w:val="0"/>
+          <w:color w:val="0E1726"/>
+          <w:sz w:val="24"/>
+        </w:rPr>
+        <w:t xml:space="preserve"> </w:t>
+      </w:r>
+      <w:r>
+        <w:rPr>
+          <w:rFonts w:ascii="Sarabun" w:hAnsi="Sarabun" w:cs="Sarabun" w:eastAsia="Sarabun"/>
+          <w:b w:val="0"/>
+          <w:i w:val="0"/>
+          <w:color w:val="0E1726"/>
+          <w:sz w:val="24"/>
+        </w:rPr>
+        <w:t>ไม่จำกัดเวลา</w:t>
+      </w:r>
+      <w:r>
+        <w:rPr>
+          <w:rFonts w:ascii="Sarabun" w:hAnsi="Sarabun" w:cs="Sarabun" w:eastAsia="Sarabun"/>
+          <w:b w:val="0"/>
+          <w:i w:val="0"/>
+          <w:color w:val="0E1726"/>
+          <w:sz w:val="24"/>
+        </w:rPr>
+        <w:t xml:space="preserve"> </w:t>
+      </w:r>
+      <w:r>
+        <w:rPr>
+          <w:rFonts w:ascii="Sarabun" w:hAnsi="Sarabun" w:cs="Sarabun" w:eastAsia="Sarabun"/>
+          <w:b w:val="0"/>
+          <w:i w:val="0"/>
+          <w:color w:val="0E1726"/>
+          <w:sz w:val="24"/>
+        </w:rPr>
+        <w:t>ทำเมื่อเสร็จ</w:t>
+      </w:r>
+      <w:r>
+        <w:rPr>
+          <w:rFonts w:ascii="Sarabun" w:hAnsi="Sarabun" w:cs="Sarabun" w:eastAsia="Sarabun"/>
+          <w:b w:val="0"/>
+          <w:i w:val="0"/>
+          <w:color w:val="0E1726"/>
+          <w:sz w:val="24"/>
+        </w:rPr>
+        <w:t xml:space="preserve"> </w:t>
+      </w:r>
+      <w:r>
+        <w:rPr>
+          <w:rFonts w:ascii="Sarabun" w:hAnsi="Sarabun" w:cs="Sarabun" w:eastAsia="Sarabun"/>
+          <w:b w:val="0"/>
+          <w:i w:val="0"/>
+          <w:color w:val="0E1726"/>
+          <w:sz w:val="24"/>
+        </w:rPr>
+        <w:t>3</w:t>
+      </w:r>
+      <w:r>
+        <w:rPr>
+          <w:rFonts w:ascii="Sarabun" w:hAnsi="Sarabun" w:cs="Sarabun" w:eastAsia="Sarabun"/>
+          <w:b w:val="0"/>
+          <w:i w:val="0"/>
+          <w:color w:val="0E1726"/>
+          <w:sz w:val="24"/>
+        </w:rPr>
+        <w:t xml:space="preserve"> </w:t>
+      </w:r>
+      <w:r>
+        <w:rPr>
+          <w:rFonts w:ascii="Sarabun" w:hAnsi="Sarabun" w:cs="Sarabun" w:eastAsia="Sarabun"/>
+          <w:b w:val="0"/>
+          <w:i w:val="0"/>
+          <w:color w:val="0E1726"/>
+          <w:sz w:val="24"/>
+        </w:rPr>
+        <w:t>ข้อหลักแล้ว</w:t>
+      </w:r>
+    </w:p>
     <w:p>
       <w:pPr>
         <w:spacing w:before="200" w:after="200"/>

</xml_diff>